<commit_message>
Atualizando o `README.md` e `relatorio.docx`, por conta de divergência de informações e/ou informações desatualizadas
</commit_message>
<xml_diff>
--- a/relatorio.docx
+++ b/relatorio.docx
@@ -702,6 +702,7 @@
         </w:rPr>
         <w:br w:type="textWrapping"/>
         <w:br w:type="textWrapping"/>
+        <w:tab/>
         <w:t xml:space="preserve">O hash de cada árvore é computado recursivamente em pós-ordem:</w:t>
         <w:br w:type="textWrapping"/>
         <w:br w:type="textWrapping"/>
@@ -728,25 +729,7 @@
           <w:rtl w:val="0"/>
         </w:rPr>
         <w:br w:type="textWrapping"/>
-        <w:t xml:space="preserve">- Filhos nulos: não contribuem para o hash (</w:t>
-      </w:r>
-      <w:r>
-        <w:rPr>
-          <w:rFonts w:ascii="Times New Roman" w:cs="Times New Roman" w:eastAsia="Times New Roman" w:hAnsi="Times New Roman"/>
-          <w:sz w:val="20"/>
-          <w:szCs w:val="20"/>
-          <w:rtl w:val="0"/>
-        </w:rPr>
-        <w:t xml:space="preserve">retornam</w:t>
-      </w:r>
-      <w:r>
-        <w:rPr>
-          <w:rFonts w:ascii="Times New Roman" w:cs="Times New Roman" w:eastAsia="Times New Roman" w:hAnsi="Times New Roman"/>
-          <w:sz w:val="20"/>
-          <w:szCs w:val="20"/>
-          <w:rtl w:val="0"/>
-        </w:rPr>
-        <w:t xml:space="preserve"> string vazia)</w:t>
+        <w:t xml:space="preserve">- Filhos nulos: não contribuem para o hash (retornam null, sendo ignorados pela verificação if (hashEsq != null) antes da concatenação)</w:t>
         <w:br w:type="textWrapping"/>
         <w:br w:type="textWrapping"/>
         <w:t xml:space="preserve">A implementação utiliza a classe </w:t>
@@ -843,7 +826,7 @@
         <w:br w:type="textWrapping"/>
         <w:br w:type="textWrapping"/>
         <w:tab/>
-        <w:t xml:space="preserve">O projeto foi desenvolvido utilizando Java como linguagem de programação e Visual Studio Code como IDE, com JDK OpenJDK 11 ou superior.</w:t>
+        <w:t xml:space="preserve">O projeto foi desenvolvido utilizando Java como linguagem de programação e Visual Studio Code como IDE, com JDK OpenJDK 8 ou superior (testado com OpenJDK 11).</w:t>
         <w:br w:type="textWrapping"/>
         <w:br w:type="textWrapping"/>
       </w:r>
@@ -918,16 +901,18 @@
         <w:t xml:space="preserve">!]</w:t>
         <w:br w:type="textWrapping"/>
         <w:br w:type="textWrapping"/>
-        <w:t xml:space="preserve">2) Inserção reversa na AVL: disciplina! → essa → muito → amo → Eu</w:t>
+        <w:t xml:space="preserve">2) Inserção reversa na AVL: disciplina → essa → muito → amo → Eu</w:t>
         <w:br w:type="textWrapping"/>
         <w:br w:type="textWrapping"/>
         <w:t xml:space="preserve">3) Árvore balanceada gerada</w:t>
         <w:br w:type="textWrapping"/>
         <w:br w:type="textWrapping"/>
-        <w:t xml:space="preserve">4) Hash final na raiz: f44040deec0de6e3100f7f772bb7a25646e71ed</w:t>
-        <w:br w:type="textWrapping"/>
-        <w:br w:type="textWrapping"/>
-        <w:t xml:space="preserve">C. Processamento do Texto Completo</w:t>
+        <w:t xml:space="preserve">4) Hash final na raiz: b1e0cbaf5145d5f3cff0d5936fed032b06839680</w:t>
+        <w:br w:type="textWrapping"/>
+        <w:br w:type="textWrapping"/>
+        <w:t xml:space="preserve">C. </w:t>
+        <w:tab/>
+        <w:t xml:space="preserve">Processamento do Texto Completo</w:t>
         <w:br w:type="textWrapping"/>
         <w:br w:type="textWrapping"/>
         <w:tab/>

</xml_diff>